<commit_message>
Credit review: say plainly it was an AI review, not a human analyst
The independent review of the first calibration (docs/35 section 13) was
done by a separate AI agent in the role of a senior credit analyst. The
methodology, the ADR, the review package, the owner decisions, docs/03
and the design document now say so, and that no human analyst has
reviewed the thresholds yet; the bank's credit risk function still
validates them before a grade is used in a credit decision. The stress
cases speak of the reviewer's range.

Co-Authored-By: Claude Opus 5.5 <noreply@anthropic.com>
Claude-Session: https://claude.ai/code/session_012HHcRrzuvMBTL2FYxXtsyv
</commit_message>
<xml_diff>
--- a/treasury-platform/docs/33-EXTERNAL-REVIEW-PACKAGE.docx
+++ b/treasury-platform/docs/33-EXTERNAL-REVIEW-PACKAGE.docx
@@ -2481,7 +2481,7 @@
           <w:szCs w:val="21"/>
           <w:rtl/>
         </w:rPr>
-        <w:t xml:space="preserve">، وتطابق أرقامها تنفيذًا مستقلًا بلغة Python. وراجع محلل ائتمان مستقل المعايرة الأولى فوجدها بعيدة 3 إلى 8 درجات في حالات عادية، فأُعيد بناؤها، وتقع الآن الحالات الست عشرة لاختبار الضغط كلها في المدى الذي يتوقعه. والشبكات معايرة خبير على منهجية موديز، لا شبكات موديز نفسها. المراجع: </w:t>
+        <w:t xml:space="preserve">، وتطابق أرقامها تنفيذًا مستقلًا بلغة Python. وراجع المعايرة الأولى وكيل ذكاء اصطناعي منفصل في دور محلل ائتمان أول، لا محلل بشري، فوجدها بعيدة 3 إلى 8 درجات في حالات عادية، فأُعيد بناؤها، وتقع الآن الحالات الست عشرة لاختبار الضغط كلها في المدى الذي يتوقعه. والشبكات معايرة خبير على منهجية موديز، لا شبكات موديز نفسها. المراجع: </w:t>
       </w:r>
       <w:r>
         <w:rPr>
@@ -8032,7 +8032,7 @@
                 <w:szCs w:val="18"/>
                 <w:rtl/>
               </w:rPr>
-              <w:t xml:space="preserve">75 من 75 فحصًا (بلا قراءة التعليقات)، و16 من 16 حالة ضغط في مدى المحلل</w:t>
+              <w:t xml:space="preserve">75 من 75 فحصًا (بلا قراءة التعليقات)، و16 من 16 حالة ضغط في مدى المراجع</w:t>
             </w:r>
           </w:p>
         </w:tc>
@@ -13274,7 +13274,7 @@
                 <w:szCs w:val="18"/>
                 <w:rtl/>
               </w:rPr>
-              <w:t xml:space="preserve">بُني داخل النظام على معايرة خبير بلا بيانات تعثّر؛ ويتحقق منها قسم مخاطر الائتمان في البنك قبل استعمال الدرجة في قرار. والربط بنظام تقييم خارجي مرحلة لاحقة. وحدوده الأخرى في </w:t>
+              <w:t xml:space="preserve">بُني داخل النظام على معايرة بالخبرة بلا بيانات تعثّر، راجعها وكيل ذكاء اصطناعي ولم يراجعها محلل بشري بعد؛ ويتحقق منها قسم مخاطر الائتمان في البنك قبل استعمال الدرجة في قرار. والربط بنظام تقييم خارجي مرحلة لاحقة. وحدوده الأخرى في </w:t>
             </w:r>
             <w:r>
               <w:rPr>

</xml_diff>

<commit_message>
Endorsement, choice reason and lender calibration; response to review v3.0 (ADR 0029)
An approved assessment of an actual statement is shown outside the company
only once endorsed, with a reason, by a holder of the new permission
fin.credit.endorse outside the preparing and approving line (AU by default);
the report shows UseScope. Choosing a presentation version now requires a
reason. fin.v_LenderRatingCalibration compares the company's assessments
with its lenders' ratings over time and shows its bias. Tests CA25, CA26
and CA19 case 7. docs/37 answers the external review v3.0 with evidence.

Co-Authored-By: Claude Opus 5.5 <noreply@anthropic.com>
Claude-Session: https://claude.ai/code/session_012HHcRrzuvMBTL2FYxXtsyv
</commit_message>
<xml_diff>
--- a/treasury-platform/docs/33-EXTERNAL-REVIEW-PACKAGE.docx
+++ b/treasury-platform/docs/33-EXTERNAL-REVIEW-PACKAGE.docx
@@ -5565,7 +5565,7 @@
                 <w:shd w:fill="F1F3F5" w:color="auto" w:val="clear"/>
                 <w:rtl/>
               </w:rPr>
-              <w:t xml:space="preserve">‎docs/adr/0001…0028‎</w:t>
+              <w:t xml:space="preserve">‎docs/adr/0001…0029‎</w:t>
             </w:r>
           </w:p>
         </w:tc>
@@ -8235,6 +8235,83 @@
                 <w:rtl/>
               </w:rPr>
               <w:t xml:space="preserve">قوالب رسائل الإنذار بالعربية والإنجليزية: حدث أحمر وآخر أصفر، وسبب الجاهزية، وأول حزمة للمشترك NTF.BASE</w:t>
+            </w:r>
+          </w:p>
+        </w:tc>
+      </w:tr>
+      <w:tr>
+        <w:trPr>
+          <w:cantSplit/>
+        </w:trPr>
+        <w:tc>
+          <w:tcPr>
+            <w:tcW w:type="dxa" w:w="1972"/>
+            <w:tcBorders>
+              <w:top w:val="single" w:color="BFC9D6" w:sz="4"/>
+              <w:left w:val="single" w:color="BFC9D6" w:sz="4"/>
+              <w:bottom w:val="single" w:color="BFC9D6" w:sz="4"/>
+              <w:right w:val="single" w:color="BFC9D6" w:sz="4"/>
+            </w:tcBorders>
+            <w:tcMar>
+              <w:top w:type="dxa" w:w="50"/>
+              <w:left w:type="dxa" w:w="90"/>
+              <w:bottom w:type="dxa" w:w="50"/>
+              <w:right w:type="dxa" w:w="90"/>
+            </w:tcMar>
+            <w:vAlign w:val="top"/>
+          </w:tcPr>
+          <w:p>
+            <w:pPr>
+              <w:keepNext w:val="false"/>
+              <w:bidi/>
+              <w:spacing w:after="30" w:before="30" w:line="264"/>
+            </w:pPr>
+            <w:r>
+              <w:rPr>
+                <w:rFonts w:ascii="Arial" w:cs="Arial" w:eastAsia="Arial" w:hAnsi="Arial"/>
+                <w:b w:val="false"/>
+                <w:bCs w:val="false"/>
+                <w:sz w:val="18"/>
+                <w:szCs w:val="18"/>
+                <w:rtl/>
+              </w:rPr>
+              <w:t xml:space="preserve">0029</w:t>
+            </w:r>
+          </w:p>
+        </w:tc>
+        <w:tc>
+          <w:tcPr>
+            <w:tcW w:type="dxa" w:w="7892"/>
+            <w:tcBorders>
+              <w:top w:val="single" w:color="BFC9D6" w:sz="4"/>
+              <w:left w:val="single" w:color="BFC9D6" w:sz="4"/>
+              <w:bottom w:val="single" w:color="BFC9D6" w:sz="4"/>
+              <w:right w:val="single" w:color="BFC9D6" w:sz="4"/>
+            </w:tcBorders>
+            <w:tcMar>
+              <w:top w:type="dxa" w:w="50"/>
+              <w:left w:type="dxa" w:w="90"/>
+              <w:bottom w:type="dxa" w:w="50"/>
+              <w:right w:type="dxa" w:w="90"/>
+            </w:tcMar>
+            <w:vAlign w:val="top"/>
+          </w:tcPr>
+          <w:p>
+            <w:pPr>
+              <w:keepNext w:val="false"/>
+              <w:bidi/>
+              <w:spacing w:after="30" w:before="30" w:line="264"/>
+            </w:pPr>
+            <w:r>
+              <w:rPr>
+                <w:rFonts w:ascii="Arial" w:cs="Arial" w:eastAsia="Arial" w:hAnsi="Arial"/>
+                <w:b w:val="false"/>
+                <w:bCs w:val="false"/>
+                <w:sz w:val="18"/>
+                <w:szCs w:val="18"/>
+                <w:rtl/>
+              </w:rPr>
+              <w:t xml:space="preserve">تصديق التقييم للاستعمال خارج الشركة، وسبب اختيار نسخة العرض، والمعايرة المتراكمة مع جهات التمويل (من المراجعة 3.0)</w:t>
             </w:r>
           </w:p>
         </w:tc>
@@ -9437,7 +9514,7 @@
                 <w:szCs w:val="18"/>
                 <w:rtl/>
               </w:rPr>
-              <w:t xml:space="preserve">142 صلاحية، و21 درجة و36 مقياسًا و3 بطاقات</w:t>
+              <w:t xml:space="preserve">143 صلاحية، و21 درجة و36 مقياسًا و3 بطاقات</w:t>
             </w:r>
           </w:p>
         </w:tc>

</xml_diff>

<commit_message>
Optional close of a company's reporting periods (ADR 0031)
fin.ReportingPeriodLock closes a company's periods through a day, once every
actual statement of them is approved and every monthly balance and bank flow
confirmed. Triggers then refuse any actual statement, version, monthly
balance or bank flow dated through that day; a budget is not closed. The
latest close is reopened with a reason by another holder of the new
permission fin.period.lock; both are audited. The evidence pack states the
close. Test CA31.

Co-Authored-By: Claude Opus 5.5 <noreply@anthropic.com>
Claude-Session: https://claude.ai/code/session_012HHcRrzuvMBTL2FYxXtsyv
</commit_message>
<xml_diff>
--- a/treasury-platform/docs/33-EXTERNAL-REVIEW-PACKAGE.docx
+++ b/treasury-platform/docs/33-EXTERNAL-REVIEW-PACKAGE.docx
@@ -5565,7 +5565,7 @@
                 <w:shd w:fill="F1F3F5" w:color="auto" w:val="clear"/>
                 <w:rtl/>
               </w:rPr>
-              <w:t xml:space="preserve">‎docs/adr/0001…0030‎</w:t>
+              <w:t xml:space="preserve">‎docs/adr/0001…0031‎</w:t>
             </w:r>
           </w:p>
         </w:tc>
@@ -8391,6 +8391,83 @@
                 <w:rtl/>
               </w:rPr>
               <w:t xml:space="preserve">تجميد الأرقام الشهرية المؤكدة، وحزمة أدلة التقييم، والمعايرة في الجاهزية، ومسؤول المخاطر RK، ومصفوفة مخصص الذمم (من المراجعة 4.0، القرار 35)</w:t>
+            </w:r>
+          </w:p>
+        </w:tc>
+      </w:tr>
+      <w:tr>
+        <w:trPr>
+          <w:cantSplit/>
+        </w:trPr>
+        <w:tc>
+          <w:tcPr>
+            <w:tcW w:type="dxa" w:w="1972"/>
+            <w:tcBorders>
+              <w:top w:val="single" w:color="BFC9D6" w:sz="4"/>
+              <w:left w:val="single" w:color="BFC9D6" w:sz="4"/>
+              <w:bottom w:val="single" w:color="BFC9D6" w:sz="4"/>
+              <w:right w:val="single" w:color="BFC9D6" w:sz="4"/>
+            </w:tcBorders>
+            <w:tcMar>
+              <w:top w:type="dxa" w:w="50"/>
+              <w:left w:type="dxa" w:w="90"/>
+              <w:bottom w:type="dxa" w:w="50"/>
+              <w:right w:type="dxa" w:w="90"/>
+            </w:tcMar>
+            <w:vAlign w:val="top"/>
+          </w:tcPr>
+          <w:p>
+            <w:pPr>
+              <w:keepNext w:val="false"/>
+              <w:bidi/>
+              <w:spacing w:after="30" w:before="30" w:line="264"/>
+            </w:pPr>
+            <w:r>
+              <w:rPr>
+                <w:rFonts w:ascii="Arial" w:cs="Arial" w:eastAsia="Arial" w:hAnsi="Arial"/>
+                <w:b w:val="false"/>
+                <w:bCs w:val="false"/>
+                <w:sz w:val="18"/>
+                <w:szCs w:val="18"/>
+                <w:rtl/>
+              </w:rPr>
+              <w:t xml:space="preserve">0031</w:t>
+            </w:r>
+          </w:p>
+        </w:tc>
+        <w:tc>
+          <w:tcPr>
+            <w:tcW w:type="dxa" w:w="7892"/>
+            <w:tcBorders>
+              <w:top w:val="single" w:color="BFC9D6" w:sz="4"/>
+              <w:left w:val="single" w:color="BFC9D6" w:sz="4"/>
+              <w:bottom w:val="single" w:color="BFC9D6" w:sz="4"/>
+              <w:right w:val="single" w:color="BFC9D6" w:sz="4"/>
+            </w:tcBorders>
+            <w:tcMar>
+              <w:top w:type="dxa" w:w="50"/>
+              <w:left w:type="dxa" w:w="90"/>
+              <w:bottom w:type="dxa" w:w="50"/>
+              <w:right w:type="dxa" w:w="90"/>
+            </w:tcMar>
+            <w:vAlign w:val="top"/>
+          </w:tcPr>
+          <w:p>
+            <w:pPr>
+              <w:keepNext w:val="false"/>
+              <w:bidi/>
+              <w:spacing w:after="30" w:before="30" w:line="264"/>
+            </w:pPr>
+            <w:r>
+              <w:rPr>
+                <w:rFonts w:ascii="Arial" w:cs="Arial" w:eastAsia="Arial" w:hAnsi="Arial"/>
+                <w:b w:val="false"/>
+                <w:bCs w:val="false"/>
+                <w:sz w:val="18"/>
+                <w:szCs w:val="18"/>
+                <w:rtl/>
+              </w:rPr>
+              <w:t xml:space="preserve">إقفال فترات الشركة اختياريًا وإعادة فتحها بيد غير من أقفل (البند 2 من دراسة المراجعة 4.0)</w:t>
             </w:r>
           </w:p>
         </w:tc>
@@ -9593,7 +9670,7 @@
                 <w:szCs w:val="18"/>
                 <w:rtl/>
               </w:rPr>
-              <w:t xml:space="preserve">143 صلاحية، و21 درجة و36 مقياسًا و3 بطاقات</w:t>
+              <w:t xml:space="preserve">144 صلاحية، و21 درجة و36 مقياسًا و3 بطاقات</w:t>
             </w:r>
           </w:p>
         </w:tc>

</xml_diff>

<commit_message>
Word files of docs/42, docs/33 and DOC-B01 for the rest of S0
Co-Authored-By: Claude Opus 5.5 <noreply@anthropic.com>
Claude-Session: https://claude.ai/code/session_012HHcRrzuvMBTL2FYxXtsyv
</commit_message>
<xml_diff>
--- a/treasury-platform/docs/33-EXTERNAL-REVIEW-PACKAGE.docx
+++ b/treasury-platform/docs/33-EXTERNAL-REVIEW-PACKAGE.docx
@@ -11741,7 +11741,7 @@
                 <w:szCs w:val="18"/>
                 <w:rtl/>
               </w:rPr>
-              <w:t xml:space="preserve">23 و12 و7 و6 و8 و2 و4 و4 و7 و7 و6</w:t>
+              <w:t xml:space="preserve">23 و14 و7 و7 و8 و2 و4 و4 و7 و7 و6</w:t>
             </w:r>
           </w:p>
         </w:tc>
@@ -12795,7 +12795,7 @@
           <w:szCs w:val="21"/>
           <w:rtl/>
         </w:rPr>
-        <w:t xml:space="preserve">) وNode.js 22. ويعمل السكربت على هذا الترتيب:</w:t>
+        <w:t xml:space="preserve">) وNode.js 22 وOpenSSL. ويعمل السكربت على هذا الترتيب:</w:t>
       </w:r>
     </w:p>
     <w:p>
@@ -12817,7 +12817,7 @@
           <w:szCs w:val="21"/>
           <w:rtl/>
         </w:rPr>
-        <w:t xml:space="preserve">يبني الحل ويشغّل اختبارات الوحدة الـ32.</w:t>
+        <w:t xml:space="preserve">يبني الحل ويشغّل اختبارات الوحدة الـ38.</w:t>
       </w:r>
     </w:p>
     <w:p>
@@ -12883,30 +12883,7 @@
           <w:szCs w:val="21"/>
           <w:rtl/>
         </w:rPr>
-        <w:t xml:space="preserve">يشغّل اختبار التكامل على القاعدة، ثم يحذف الحسابات.</w:t>
-      </w:r>
-    </w:p>
-    <w:p>
-      <w:pPr>
-        <w:bidi/>
-        <w:spacing w:after="60" w:before="0"/>
-      </w:pPr>
-    </w:p>
-    <w:p>
-      <w:pPr>
-        <w:bidi/>
-        <w:spacing w:after="110" w:before="0" w:line="312"/>
-      </w:pPr>
-      <w:r>
-        <w:rPr>
-          <w:rFonts w:ascii="Arial" w:cs="Arial" w:eastAsia="Arial" w:hAnsi="Arial"/>
-          <w:b w:val="false"/>
-          <w:bCs w:val="false"/>
-          <w:sz w:val="21"/>
-          <w:szCs w:val="21"/>
-          <w:rtl/>
-        </w:rPr>
-        <w:t xml:space="preserve">وينتهي بـ «application CI passed». ويحتاج اختبار التكامل قاعدة لم يُنشأ فيها مشغّل بعد، كالتي ينشرها </w:t>
+        <w:t xml:space="preserve">يشغّل اختبار المتصفح (</w:t>
       </w:r>
       <w:r>
         <w:rPr>
@@ -12919,6 +12896,75 @@
           <w:shd w:fill="F1F3F5" w:color="auto" w:val="clear"/>
           <w:rtl/>
         </w:rPr>
+        <w:t xml:space="preserve">‎tools/ci/e2e.sh‎</w:t>
+      </w:r>
+      <w:r>
+        <w:rPr>
+          <w:rFonts w:ascii="Arial" w:cs="Arial" w:eastAsia="Arial" w:hAnsi="Arial"/>
+          <w:b w:val="false"/>
+          <w:bCs w:val="false"/>
+          <w:sz w:val="21"/>
+          <w:szCs w:val="21"/>
+          <w:rtl/>
+        </w:rPr>
+        <w:t xml:space="preserve">). يشغّل الواجهة والعامل على HTTPS بشهادة مؤقتة، ثم يمر Chromium بمسار الخروج من S0 كاملًا.</w:t>
+      </w:r>
+    </w:p>
+    <w:p>
+      <w:pPr>
+        <w:pStyle w:val="ListParagraph"/>
+        <w:numPr>
+          <w:ilvl w:val="0"/>
+          <w:numId w:val="5"/>
+        </w:numPr>
+        <w:bidi/>
+        <w:spacing w:after="70" w:before="0" w:line="300"/>
+      </w:pPr>
+      <w:r>
+        <w:rPr>
+          <w:rFonts w:ascii="Arial" w:cs="Arial" w:eastAsia="Arial" w:hAnsi="Arial"/>
+          <w:b w:val="false"/>
+          <w:bCs w:val="false"/>
+          <w:sz w:val="21"/>
+          <w:szCs w:val="21"/>
+          <w:rtl/>
+        </w:rPr>
+        <w:t xml:space="preserve">يشغّل اختبارات التكامل الـ14 على القاعدة، ثم يحذف الحسابات.</w:t>
+      </w:r>
+    </w:p>
+    <w:p>
+      <w:pPr>
+        <w:bidi/>
+        <w:spacing w:after="60" w:before="0"/>
+      </w:pPr>
+    </w:p>
+    <w:p>
+      <w:pPr>
+        <w:bidi/>
+        <w:spacing w:after="110" w:before="0" w:line="312"/>
+      </w:pPr>
+      <w:r>
+        <w:rPr>
+          <w:rFonts w:ascii="Arial" w:cs="Arial" w:eastAsia="Arial" w:hAnsi="Arial"/>
+          <w:b w:val="false"/>
+          <w:bCs w:val="false"/>
+          <w:sz w:val="21"/>
+          <w:szCs w:val="21"/>
+          <w:rtl/>
+        </w:rPr>
+        <w:t xml:space="preserve">وينتهي بـ «application CI passed». ويحتاج السكربت قاعدة لم يُنشأ فيها مشغّل بعد، كالتي ينشرها </w:t>
+      </w:r>
+      <w:r>
+        <w:rPr>
+          <w:rFonts w:ascii="Courier New" w:cs="Courier New" w:eastAsia="Courier New" w:hAnsi="Courier New"/>
+          <w:b w:val="false"/>
+          <w:bCs w:val="false"/>
+          <w:color w:val="1F2937"/>
+          <w:sz w:val="18"/>
+          <w:szCs w:val="18"/>
+          <w:shd w:fill="F1F3F5" w:color="auto" w:val="clear"/>
+          <w:rtl/>
+        </w:rPr>
         <w:t xml:space="preserve">‎db_ci.sh‎</w:t>
       </w:r>
       <w:r>
@@ -12930,7 +12976,31 @@
           <w:szCs w:val="21"/>
           <w:rtl/>
         </w:rPr>
-        <w:t xml:space="preserve">.</w:t>
+        <w:t xml:space="preserve">. وإن لم يكن Chromium مثبتًا في </w:t>
+      </w:r>
+      <w:r>
+        <w:rPr>
+          <w:rFonts w:ascii="Courier New" w:cs="Courier New" w:eastAsia="Courier New" w:hAnsi="Courier New"/>
+          <w:b w:val="false"/>
+          <w:bCs w:val="false"/>
+          <w:color w:val="1F2937"/>
+          <w:sz w:val="18"/>
+          <w:szCs w:val="18"/>
+          <w:shd w:fill="F1F3F5" w:color="auto" w:val="clear"/>
+          <w:rtl/>
+        </w:rPr>
+        <w:t xml:space="preserve">‎/opt/pw-browsers‎</w:t>
+      </w:r>
+      <w:r>
+        <w:rPr>
+          <w:rFonts w:ascii="Arial" w:cs="Arial" w:eastAsia="Arial" w:hAnsi="Arial"/>
+          <w:b w:val="false"/>
+          <w:bCs w:val="false"/>
+          <w:sz w:val="21"/>
+          <w:szCs w:val="21"/>
+          <w:rtl/>
+        </w:rPr>
+        <w:t xml:space="preserve"> نزّله Playwright.</w:t>
       </w:r>
     </w:p>
     <w:p>

</xml_diff>